<commit_message>
Added demo 3 and added resource folder.
</commit_message>
<xml_diff>
--- a/Demos/Tier 1/Demo 1 - Legacy Code.docx
+++ b/Demos/Tier 1/Demo 1 - Legacy Code.docx
@@ -63,7 +63,7 @@
           <w:b/>
           <w:sz w:val="26"/>
         </w:rPr>
-        <w:t>Step 1 — Open the workspace folder</w:t>
+        <w:t>Step 1 - Open the example code</w:t>
       </w:r>
     </w:p>
     <w:p>
@@ -74,7 +74,7 @@
         <w:rPr>
           <w:rFonts w:ascii="IBM Plex Sans" w:eastAsia="IBM Plex Sans" w:hAnsi="IBM Plex Sans"/>
         </w:rPr>
-        <w:t>If you have not already done so, open the workspace in VS Code. Bob runs inside VS Code as an AI assistant in the sidebar.</w:t>
+        <w:t>In VS Code, go to File - Open Folder and open the following folder:</w:t>
       </w:r>
     </w:p>
     <w:p>
@@ -120,7 +120,7 @@
           <w:color w:val="FFFFFF"/>
           <w:sz w:val="20"/>
         </w:rPr>
-        <w:t>Demos/Example Code/COBOL/</w:t>
+        <w:t>Demos/Resources/Example Code/COBOL/</w:t>
       </w:r>
       <w:proofErr w:type="spellStart"/>
       <w:r>
@@ -150,24 +150,6 @@
         <w:t>merge_sort</w:t>
       </w:r>
       <w:proofErr w:type="spellEnd"/>
-      <w:r>
-        <w:rPr>
-          <w:rFonts w:ascii="Courier New" w:eastAsia="Courier New" w:hAnsi="Courier New"/>
-          <w:color w:val="FFFFFF"/>
-          <w:sz w:val="20"/>
-        </w:rPr>
-        <w:t>/</w:t>
-      </w:r>
-      <w:proofErr w:type="spellStart"/>
-      <w:r>
-        <w:rPr>
-          <w:rFonts w:ascii="Courier New" w:eastAsia="Courier New" w:hAnsi="Courier New"/>
-          <w:color w:val="FFFFFF"/>
-          <w:sz w:val="20"/>
-        </w:rPr>
-        <w:t>merge_sort_test.cbl</w:t>
-      </w:r>
-      <w:proofErr w:type="spellEnd"/>
     </w:p>
     <w:p>
       <w:pPr>
@@ -177,7 +159,7 @@
         <w:rPr>
           <w:rFonts w:ascii="IBM Plex Sans" w:eastAsia="IBM Plex Sans" w:hAnsi="IBM Plex Sans"/>
         </w:rPr>
-        <w:t>Other language examples are also available in the same parent folder under Java and RPGL if you'd prefer to use those instead.</w:t>
+        <w:t>This opens the merge sort project as the workspace, so Bob has direct visibility of its files. Other language examples are also available under the Java and RPGL folders if you'd prefer to use those instead.</w:t>
       </w:r>
     </w:p>
     <w:p>
@@ -190,7 +172,7 @@
           <w:b/>
           <w:sz w:val="26"/>
         </w:rPr>
-        <w:t>Step 3 — Open a file in the editor</w:t>
+        <w:t>Step 2 - Open the file in the editor</w:t>
       </w:r>
     </w:p>
     <w:p>
@@ -201,21 +183,7 @@
         <w:rPr>
           <w:rFonts w:ascii="IBM Plex Sans" w:eastAsia="IBM Plex Sans" w:hAnsi="IBM Plex Sans"/>
         </w:rPr>
-        <w:t xml:space="preserve">Single-click the file </w:t>
-      </w:r>
-      <w:proofErr w:type="spellStart"/>
-      <w:r>
-        <w:rPr>
-          <w:rFonts w:ascii="IBM Plex Sans" w:eastAsia="IBM Plex Sans" w:hAnsi="IBM Plex Sans"/>
-        </w:rPr>
-        <w:t>merge_sort_test.cbl</w:t>
-      </w:r>
-      <w:proofErr w:type="spellEnd"/>
-      <w:r>
-        <w:rPr>
-          <w:rFonts w:ascii="IBM Plex Sans" w:eastAsia="IBM Plex Sans" w:hAnsi="IBM Plex Sans"/>
-        </w:rPr>
-        <w:t xml:space="preserve"> to open it in the editor. You should see the COBOL source code displayed in the main editor area.</w:t>
+        <w:t>Single-click merge_sort_test.cbl in the Explorer panel to open it in the editor. You should see the COBOL source code displayed in the main editor area.</w:t>
       </w:r>
     </w:p>
     <w:p>
@@ -252,7 +220,7 @@
           <w:b/>
           <w:sz w:val="26"/>
         </w:rPr>
-        <w:t>Step 4 — Open Bob</w:t>
+        <w:t>Step 3 - Open Bob</w:t>
       </w:r>
     </w:p>
     <w:p>
@@ -264,86 +232,6 @@
           <w:rFonts w:ascii="IBM Plex Sans" w:eastAsia="IBM Plex Sans" w:hAnsi="IBM Plex Sans"/>
         </w:rPr>
         <w:t>Click the Bob icon in the VS Code Activity Bar (the icon panel on the far left). The Bob chat panel will open on the right-hand side of the screen.</w:t>
-      </w:r>
-    </w:p>
-    <w:p>
-      <w:pPr>
-        <w:spacing w:before="160" w:after="80"/>
-      </w:pPr>
-      <w:r>
-        <w:rPr>
-          <w:rFonts w:ascii="IBM Plex Sans" w:eastAsia="IBM Plex Sans" w:hAnsi="IBM Plex Sans"/>
-          <w:b/>
-          <w:sz w:val="26"/>
-        </w:rPr>
-        <w:t>Step 5 — Add the file to context</w:t>
-      </w:r>
-    </w:p>
-    <w:p>
-      <w:pPr>
-        <w:spacing w:after="80" w:line="360" w:lineRule="auto"/>
-      </w:pPr>
-      <w:r>
-        <w:rPr>
-          <w:rFonts w:ascii="IBM Plex Sans" w:eastAsia="IBM Plex Sans" w:hAnsi="IBM Plex Sans"/>
-        </w:rPr>
-        <w:t xml:space="preserve">With </w:t>
-      </w:r>
-      <w:proofErr w:type="spellStart"/>
-      <w:r>
-        <w:rPr>
-          <w:rFonts w:ascii="IBM Plex Sans" w:eastAsia="IBM Plex Sans" w:hAnsi="IBM Plex Sans"/>
-        </w:rPr>
-        <w:t>merge_sort_test.cbl</w:t>
-      </w:r>
-      <w:proofErr w:type="spellEnd"/>
-      <w:r>
-        <w:rPr>
-          <w:rFonts w:ascii="IBM Plex Sans" w:eastAsia="IBM Plex Sans" w:hAnsi="IBM Plex Sans"/>
-        </w:rPr>
-        <w:t xml:space="preserve"> open and active in the editor, you can either:</w:t>
-      </w:r>
-    </w:p>
-    <w:p>
-      <w:pPr>
-        <w:numPr>
-          <w:ilvl w:val="0"/>
-          <w:numId w:val="1"/>
-        </w:numPr>
-        <w:spacing w:after="40" w:line="360" w:lineRule="auto"/>
-      </w:pPr>
-      <w:r>
-        <w:rPr>
-          <w:rFonts w:ascii="IBM Plex Sans" w:eastAsia="IBM Plex Sans" w:hAnsi="IBM Plex Sans"/>
-        </w:rPr>
-        <w:t>Right-click inside the file and select Add File to Bob Context, or</w:t>
-      </w:r>
-    </w:p>
-    <w:p>
-      <w:pPr>
-        <w:numPr>
-          <w:ilvl w:val="0"/>
-          <w:numId w:val="1"/>
-        </w:numPr>
-        <w:spacing w:after="160" w:line="360" w:lineRule="auto"/>
-      </w:pPr>
-      <w:r>
-        <w:rPr>
-          <w:rFonts w:ascii="IBM Plex Sans" w:eastAsia="IBM Plex Sans" w:hAnsi="IBM Plex Sans"/>
-        </w:rPr>
-        <w:lastRenderedPageBreak/>
-        <w:t>Use the paperclip / @ mention button in the Bob chat input to attach the file manually.</w:t>
-      </w:r>
-    </w:p>
-    <w:p>
-      <w:pPr>
-        <w:spacing w:after="240" w:line="360" w:lineRule="auto"/>
-      </w:pPr>
-      <w:r>
-        <w:rPr>
-          <w:rFonts w:ascii="IBM Plex Sans" w:eastAsia="IBM Plex Sans" w:hAnsi="IBM Plex Sans"/>
-        </w:rPr>
-        <w:t>The filename will appear as a chip/tag in the Bob chat input, confirming it is included in context.</w:t>
       </w:r>
     </w:p>
     <w:p>
@@ -356,7 +244,7 @@
           <w:b/>
           <w:sz w:val="32"/>
         </w:rPr>
-        <w:t>3. Example Prompt — Explain This Code</w:t>
+        <w:t>3. Example Prompt - Explain This Code</w:t>
       </w:r>
     </w:p>
     <w:p>
@@ -367,7 +255,7 @@
         <w:rPr>
           <w:rFonts w:ascii="IBM Plex Sans" w:eastAsia="IBM Plex Sans" w:hAnsi="IBM Plex Sans"/>
         </w:rPr>
-        <w:t>With the file added to context, type the following prompt into the Bob chat input and press Enter:</w:t>
+        <w:t>Type the following prompt into the Bob chat input and press Enter:</w:t>
       </w:r>
     </w:p>
     <w:p>
@@ -392,6 +280,7 @@
           <w:bCs/>
           <w:color w:val="FFFFFF"/>
         </w:rPr>
+        <w:lastRenderedPageBreak/>
         <w:t>Explain this code</w:t>
       </w:r>
     </w:p>
@@ -586,14 +475,7 @@
         <w:rPr>
           <w:rFonts w:ascii="IBM Plex Sans" w:eastAsia="IBM Plex Sans" w:hAnsi="IBM Plex Sans"/>
         </w:rPr>
-        <w:t xml:space="preserve">Bob will produce a plan covering data structure mappings, file I/O equivalents, sorting library options (e.g. Python's built-in sorted()), and a recommended </w:t>
-      </w:r>
-      <w:r>
-        <w:rPr>
-          <w:rFonts w:ascii="IBM Plex Sans" w:eastAsia="IBM Plex Sans" w:hAnsi="IBM Plex Sans"/>
-        </w:rPr>
-        <w:lastRenderedPageBreak/>
-        <w:t>migration sequence. Review the plan with the audience before proceeding to the next step.</w:t>
+        <w:t>Bob will produce a plan covering data structure mappings, file I/O equivalents, sorting library options (e.g. Python's built-in sorted()), and a recommended migration sequence. Review the plan with the audience before proceeding to the next step.</w:t>
       </w:r>
     </w:p>
     <w:p>
@@ -675,6 +557,7 @@
           <w:color w:val="FFFFFF"/>
           <w:sz w:val="20"/>
         </w:rPr>
+        <w:lastRenderedPageBreak/>
         <w:t>Refactor this COBOL program to use modern best practices — improve variable naming, remove any redundant paragraphs, and add inline comments explaining each major section.</w:t>
       </w:r>
     </w:p>
@@ -807,7 +690,23 @@
           <w:color w:val="FFFFFF"/>
           <w:sz w:val="20"/>
         </w:rPr>
-        <w:t>Demos/Example Code/Java/</w:t>
+        <w:t>Demos/</w:t>
+      </w:r>
+      <w:r>
+        <w:rPr>
+          <w:rFonts w:ascii="Courier New" w:eastAsia="Courier New" w:hAnsi="Courier New"/>
+          <w:color w:val="FFFFFF"/>
+          <w:sz w:val="20"/>
+        </w:rPr>
+        <w:t>Resources/</w:t>
+      </w:r>
+      <w:r>
+        <w:rPr>
+          <w:rFonts w:ascii="Courier New" w:eastAsia="Courier New" w:hAnsi="Courier New"/>
+          <w:color w:val="FFFFFF"/>
+          <w:sz w:val="20"/>
+        </w:rPr>
+        <w:t>Example Code/Java/</w:t>
       </w:r>
       <w:proofErr w:type="spellStart"/>
       <w:r>
@@ -900,6 +799,43 @@
     </w:p>
     <w:p>
       <w:pPr>
+        <w:spacing w:after="240" w:line="360" w:lineRule="auto"/>
+        <w:rPr>
+          <w:rFonts w:ascii="IBM Plex Sans" w:eastAsia="IBM Plex Sans" w:hAnsi="IBM Plex Sans"/>
+        </w:rPr>
+      </w:pPr>
+    </w:p>
+    <w:p>
+      <w:pPr>
+        <w:spacing w:after="240" w:line="360" w:lineRule="auto"/>
+        <w:rPr>
+          <w:rFonts w:ascii="IBM Plex Sans" w:eastAsia="IBM Plex Sans" w:hAnsi="IBM Plex Sans"/>
+        </w:rPr>
+      </w:pPr>
+    </w:p>
+    <w:p>
+      <w:pPr>
+        <w:spacing w:after="240" w:line="360" w:lineRule="auto"/>
+        <w:rPr>
+          <w:rFonts w:ascii="IBM Plex Sans" w:eastAsia="IBM Plex Sans" w:hAnsi="IBM Plex Sans"/>
+        </w:rPr>
+      </w:pPr>
+    </w:p>
+    <w:p>
+      <w:pPr>
+        <w:spacing w:after="240" w:line="360" w:lineRule="auto"/>
+        <w:rPr>
+          <w:rFonts w:ascii="IBM Plex Sans" w:eastAsia="IBM Plex Sans" w:hAnsi="IBM Plex Sans"/>
+        </w:rPr>
+      </w:pPr>
+    </w:p>
+    <w:p>
+      <w:pPr>
+        <w:spacing w:after="240" w:line="360" w:lineRule="auto"/>
+      </w:pPr>
+    </w:p>
+    <w:p>
+      <w:pPr>
         <w:spacing w:before="240" w:after="120"/>
       </w:pPr>
       <w:r>
@@ -925,21 +861,6 @@
           <w:rFonts w:ascii="IBM Plex Sans" w:eastAsia="IBM Plex Sans" w:hAnsi="IBM Plex Sans"/>
         </w:rPr>
         <w:t>Keep it conversational — Bob is a chat interface, not a form. Follow-up questions work exactly as they would with a colleague.</w:t>
-      </w:r>
-    </w:p>
-    <w:p>
-      <w:pPr>
-        <w:numPr>
-          <w:ilvl w:val="0"/>
-          <w:numId w:val="4"/>
-        </w:numPr>
-        <w:spacing w:after="80" w:line="360" w:lineRule="auto"/>
-      </w:pPr>
-      <w:r>
-        <w:rPr>
-          <w:rFonts w:ascii="IBM Plex Sans" w:eastAsia="IBM Plex Sans" w:hAnsi="IBM Plex Sans"/>
-        </w:rPr>
-        <w:t>Show the context chip — point out the file tag in the input box to show the audience that Bob knows exactly which file is being discussed.</w:t>
       </w:r>
     </w:p>
     <w:p>

</xml_diff>

<commit_message>
Updated fonts on demos.
</commit_message>
<xml_diff>
--- a/Demos/Tier 1/Demo 1 - Legacy Code.docx
+++ b/Demos/Tier 1/Demo 1 - Legacy Code.docx
@@ -113,10 +113,13 @@
         <w:shd w:val="clear" w:color="auto" w:fill="1F70C1"/>
         <w:spacing w:before="160" w:after="160"/>
         <w:ind w:left="240" w:right="240"/>
-      </w:pPr>
-      <w:r>
-        <w:rPr>
-          <w:rFonts w:ascii="Courier New" w:eastAsia="Courier New" w:hAnsi="Courier New"/>
+        <w:rPr>
+          <w:rFonts w:ascii="IBM Plex Mono" w:hAnsi="IBM Plex Mono"/>
+        </w:rPr>
+      </w:pPr>
+      <w:r>
+        <w:rPr>
+          <w:rFonts w:ascii="IBM Plex Mono" w:eastAsia="Courier New" w:hAnsi="IBM Plex Mono"/>
           <w:color w:val="FFFFFF"/>
           <w:sz w:val="20"/>
         </w:rPr>
@@ -125,7 +128,7 @@
       <w:proofErr w:type="spellStart"/>
       <w:r>
         <w:rPr>
-          <w:rFonts w:ascii="Courier New" w:eastAsia="Courier New" w:hAnsi="Courier New"/>
+          <w:rFonts w:ascii="IBM Plex Mono" w:eastAsia="Courier New" w:hAnsi="IBM Plex Mono"/>
           <w:color w:val="FFFFFF"/>
           <w:sz w:val="20"/>
         </w:rPr>
@@ -134,7 +137,7 @@
       <w:proofErr w:type="spellEnd"/>
       <w:r>
         <w:rPr>
-          <w:rFonts w:ascii="Courier New" w:eastAsia="Courier New" w:hAnsi="Courier New"/>
+          <w:rFonts w:ascii="IBM Plex Mono" w:eastAsia="Courier New" w:hAnsi="IBM Plex Mono"/>
           <w:color w:val="FFFFFF"/>
           <w:sz w:val="20"/>
         </w:rPr>
@@ -143,7 +146,7 @@
       <w:proofErr w:type="spellStart"/>
       <w:r>
         <w:rPr>
-          <w:rFonts w:ascii="Courier New" w:eastAsia="Courier New" w:hAnsi="Courier New"/>
+          <w:rFonts w:ascii="IBM Plex Mono" w:eastAsia="Courier New" w:hAnsi="IBM Plex Mono"/>
           <w:color w:val="FFFFFF"/>
           <w:sz w:val="20"/>
         </w:rPr>
@@ -271,12 +274,13 @@
         <w:spacing w:before="160" w:after="160"/>
         <w:ind w:left="240" w:right="240"/>
         <w:rPr>
+          <w:rFonts w:ascii="IBM Plex Mono" w:hAnsi="IBM Plex Mono"/>
           <w:bCs/>
         </w:rPr>
       </w:pPr>
       <w:r>
         <w:rPr>
-          <w:rFonts w:ascii="Courier New" w:eastAsia="Courier New" w:hAnsi="Courier New"/>
+          <w:rFonts w:ascii="IBM Plex Mono" w:eastAsia="Courier New" w:hAnsi="IBM Plex Mono"/>
           <w:bCs/>
           <w:color w:val="FFFFFF"/>
         </w:rPr>
@@ -441,10 +445,13 @@
         <w:shd w:val="clear" w:color="auto" w:fill="1F70C1"/>
         <w:spacing w:before="160" w:after="160"/>
         <w:ind w:left="240" w:right="240"/>
-      </w:pPr>
-      <w:r>
-        <w:rPr>
-          <w:rFonts w:ascii="Courier New" w:eastAsia="Courier New" w:hAnsi="Courier New"/>
+        <w:rPr>
+          <w:rFonts w:ascii="IBM Plex Mono" w:hAnsi="IBM Plex Mono"/>
+        </w:rPr>
+      </w:pPr>
+      <w:r>
+        <w:rPr>
+          <w:rFonts w:ascii="IBM Plex Mono" w:eastAsia="Courier New" w:hAnsi="IBM Plex Mono"/>
           <w:color w:val="FFFFFF"/>
           <w:sz w:val="20"/>
         </w:rPr>
@@ -452,7 +459,7 @@
       </w:r>
       <w:r>
         <w:rPr>
-          <w:rFonts w:ascii="Courier New" w:eastAsia="Courier New" w:hAnsi="Courier New"/>
+          <w:rFonts w:ascii="IBM Plex Mono" w:eastAsia="Courier New" w:hAnsi="IBM Plex Mono"/>
           <w:color w:val="FFFFFF"/>
           <w:sz w:val="20"/>
         </w:rPr>
@@ -460,7 +467,7 @@
       </w:r>
       <w:r>
         <w:rPr>
-          <w:rFonts w:ascii="Courier New" w:eastAsia="Courier New" w:hAnsi="Courier New"/>
+          <w:rFonts w:ascii="IBM Plex Mono" w:eastAsia="Courier New" w:hAnsi="IBM Plex Mono"/>
           <w:color w:val="FFFFFF"/>
           <w:sz w:val="20"/>
         </w:rPr>
@@ -502,12 +509,13 @@
         <w:spacing w:before="160" w:after="160"/>
         <w:ind w:left="240" w:right="240"/>
         <w:rPr>
+          <w:rFonts w:ascii="IBM Plex Mono" w:hAnsi="IBM Plex Mono"/>
           <w:bCs/>
         </w:rPr>
       </w:pPr>
       <w:r>
         <w:rPr>
-          <w:rFonts w:ascii="Courier New" w:eastAsia="Courier New" w:hAnsi="Courier New"/>
+          <w:rFonts w:ascii="IBM Plex Mono" w:eastAsia="Courier New" w:hAnsi="IBM Plex Mono"/>
           <w:bCs/>
           <w:color w:val="FFFFFF"/>
         </w:rPr>
@@ -550,10 +558,13 @@
         <w:shd w:val="clear" w:color="auto" w:fill="1F70C1"/>
         <w:spacing w:before="160" w:after="160"/>
         <w:ind w:left="240" w:right="240"/>
-      </w:pPr>
-      <w:r>
-        <w:rPr>
-          <w:rFonts w:ascii="Courier New" w:eastAsia="Courier New" w:hAnsi="Courier New"/>
+        <w:rPr>
+          <w:rFonts w:ascii="IBM Plex Mono" w:hAnsi="IBM Plex Mono"/>
+        </w:rPr>
+      </w:pPr>
+      <w:r>
+        <w:rPr>
+          <w:rFonts w:ascii="IBM Plex Mono" w:eastAsia="Courier New" w:hAnsi="IBM Plex Mono"/>
           <w:color w:val="FFFFFF"/>
           <w:sz w:val="20"/>
         </w:rPr>
@@ -608,10 +619,13 @@
         <w:shd w:val="clear" w:color="auto" w:fill="1F70C1"/>
         <w:spacing w:before="160" w:after="160"/>
         <w:ind w:left="240" w:right="240"/>
-      </w:pPr>
-      <w:r>
-        <w:rPr>
-          <w:rFonts w:ascii="Courier New" w:eastAsia="Courier New" w:hAnsi="Courier New"/>
+        <w:rPr>
+          <w:rFonts w:ascii="IBM Plex Mono" w:hAnsi="IBM Plex Mono"/>
+        </w:rPr>
+      </w:pPr>
+      <w:r>
+        <w:rPr>
+          <w:rFonts w:ascii="IBM Plex Mono" w:eastAsia="Courier New" w:hAnsi="IBM Plex Mono"/>
           <w:color w:val="FFFFFF"/>
           <w:sz w:val="20"/>
         </w:rPr>
@@ -620,7 +634,7 @@
       <w:proofErr w:type="spellStart"/>
       <w:r>
         <w:rPr>
-          <w:rFonts w:ascii="Courier New" w:eastAsia="Courier New" w:hAnsi="Courier New"/>
+          <w:rFonts w:ascii="IBM Plex Mono" w:eastAsia="Courier New" w:hAnsi="IBM Plex Mono"/>
           <w:color w:val="FFFFFF"/>
           <w:sz w:val="20"/>
         </w:rPr>
@@ -629,7 +643,7 @@
       <w:proofErr w:type="spellEnd"/>
       <w:r>
         <w:rPr>
-          <w:rFonts w:ascii="Courier New" w:eastAsia="Courier New" w:hAnsi="Courier New"/>
+          <w:rFonts w:ascii="IBM Plex Mono" w:eastAsia="Courier New" w:hAnsi="IBM Plex Mono"/>
           <w:color w:val="FFFFFF"/>
           <w:sz w:val="20"/>
         </w:rPr>
@@ -683,10 +697,13 @@
         <w:shd w:val="clear" w:color="auto" w:fill="1F70C1"/>
         <w:spacing w:before="160" w:after="160"/>
         <w:ind w:left="240" w:right="240"/>
-      </w:pPr>
-      <w:r>
-        <w:rPr>
-          <w:rFonts w:ascii="Courier New" w:eastAsia="Courier New" w:hAnsi="Courier New"/>
+        <w:rPr>
+          <w:rFonts w:ascii="IBM Plex Mono" w:hAnsi="IBM Plex Mono"/>
+        </w:rPr>
+      </w:pPr>
+      <w:r>
+        <w:rPr>
+          <w:rFonts w:ascii="IBM Plex Mono" w:eastAsia="Courier New" w:hAnsi="IBM Plex Mono"/>
           <w:color w:val="FFFFFF"/>
           <w:sz w:val="20"/>
         </w:rPr>
@@ -694,7 +711,7 @@
       </w:r>
       <w:r>
         <w:rPr>
-          <w:rFonts w:ascii="Courier New" w:eastAsia="Courier New" w:hAnsi="Courier New"/>
+          <w:rFonts w:ascii="IBM Plex Mono" w:eastAsia="Courier New" w:hAnsi="IBM Plex Mono"/>
           <w:color w:val="FFFFFF"/>
           <w:sz w:val="20"/>
         </w:rPr>
@@ -702,7 +719,7 @@
       </w:r>
       <w:r>
         <w:rPr>
-          <w:rFonts w:ascii="Courier New" w:eastAsia="Courier New" w:hAnsi="Courier New"/>
+          <w:rFonts w:ascii="IBM Plex Mono" w:eastAsia="Courier New" w:hAnsi="IBM Plex Mono"/>
           <w:color w:val="FFFFFF"/>
           <w:sz w:val="20"/>
         </w:rPr>
@@ -711,7 +728,7 @@
       <w:proofErr w:type="spellStart"/>
       <w:r>
         <w:rPr>
-          <w:rFonts w:ascii="Courier New" w:eastAsia="Courier New" w:hAnsi="Courier New"/>
+          <w:rFonts w:ascii="IBM Plex Mono" w:eastAsia="Courier New" w:hAnsi="IBM Plex Mono"/>
           <w:color w:val="FFFFFF"/>
           <w:sz w:val="20"/>
         </w:rPr>
@@ -720,7 +737,7 @@
       <w:proofErr w:type="spellEnd"/>
       <w:r>
         <w:rPr>
-          <w:rFonts w:ascii="Courier New" w:eastAsia="Courier New" w:hAnsi="Courier New"/>
+          <w:rFonts w:ascii="IBM Plex Mono" w:eastAsia="Courier New" w:hAnsi="IBM Plex Mono"/>
           <w:color w:val="FFFFFF"/>
           <w:sz w:val="20"/>
         </w:rPr>
@@ -844,7 +861,6 @@
           <w:b/>
           <w:sz w:val="32"/>
         </w:rPr>
-        <w:lastRenderedPageBreak/>
         <w:t>Tips for the Demo</w:t>
       </w:r>
     </w:p>

</xml_diff>

<commit_message>
Updated demo docs, and created first part of finished exampe files for demo 3
</commit_message>
<xml_diff>
--- a/Demos/Tier 1/Demo 1 - Legacy Code.docx
+++ b/Demos/Tier 1/Demo 1 - Legacy Code.docx
@@ -37,7 +37,19 @@
         <w:rPr>
           <w:rFonts w:ascii="IBM Plex Sans" w:eastAsia="IBM Plex Sans" w:hAnsi="IBM Plex Sans"/>
         </w:rPr>
-        <w:t>This guide walks you through a short, hands-on IBM Bob demo using the example code files included in this workspace. No setup required — just follow the steps below.</w:t>
+        <w:t>This guide walks you through a short, hands-on IBM Bob demo using the example code files included in this workspace</w:t>
+      </w:r>
+      <w:r>
+        <w:rPr>
+          <w:rFonts w:ascii="IBM Plex Sans" w:eastAsia="IBM Plex Sans" w:hAnsi="IBM Plex Sans"/>
+        </w:rPr>
+        <w:t>, written in COBOL, Java, or RPGL</w:t>
+      </w:r>
+      <w:r>
+        <w:rPr>
+          <w:rFonts w:ascii="IBM Plex Sans" w:eastAsia="IBM Plex Sans" w:hAnsi="IBM Plex Sans"/>
+        </w:rPr>
+        <w:t>. No setup required — just follow the steps below.</w:t>
       </w:r>
     </w:p>
     <w:p>
@@ -258,7 +270,19 @@
         <w:rPr>
           <w:rFonts w:ascii="IBM Plex Sans" w:eastAsia="IBM Plex Sans" w:hAnsi="IBM Plex Sans"/>
         </w:rPr>
-        <w:t>Type the following prompt into the Bob chat input and press Enter:</w:t>
+        <w:t xml:space="preserve">Type the following prompt into the Bob chat </w:t>
+      </w:r>
+      <w:r>
+        <w:rPr>
+          <w:rFonts w:ascii="IBM Plex Sans" w:eastAsia="IBM Plex Sans" w:hAnsi="IBM Plex Sans"/>
+        </w:rPr>
+        <w:t xml:space="preserve">using the ‘Ask’ Mode </w:t>
+      </w:r>
+      <w:r>
+        <w:rPr>
+          <w:rFonts w:ascii="IBM Plex Sans" w:eastAsia="IBM Plex Sans" w:hAnsi="IBM Plex Sans"/>
+        </w:rPr>
+        <w:t>input and press Enter:</w:t>
       </w:r>
     </w:p>
     <w:p>
@@ -430,7 +454,19 @@
         <w:rPr>
           <w:rFonts w:ascii="IBM Plex Sans" w:eastAsia="IBM Plex Sans" w:hAnsi="IBM Plex Sans"/>
         </w:rPr>
-        <w:t>Ask Bob to produce a structured migration plan without writing any code yet:</w:t>
+        <w:t xml:space="preserve">Ask Bob </w:t>
+      </w:r>
+      <w:r>
+        <w:rPr>
+          <w:rFonts w:ascii="IBM Plex Sans" w:eastAsia="IBM Plex Sans" w:hAnsi="IBM Plex Sans"/>
+        </w:rPr>
+        <w:t xml:space="preserve">in the ‘Plan’ mode </w:t>
+      </w:r>
+      <w:r>
+        <w:rPr>
+          <w:rFonts w:ascii="IBM Plex Sans" w:eastAsia="IBM Plex Sans" w:hAnsi="IBM Plex Sans"/>
+        </w:rPr>
+        <w:t>to produce a structured migration plan without writing any code yet:</w:t>
       </w:r>
     </w:p>
     <w:p>
@@ -493,7 +529,19 @@
         <w:rPr>
           <w:rFonts w:ascii="IBM Plex Sans" w:eastAsia="IBM Plex Sans" w:hAnsi="IBM Plex Sans"/>
         </w:rPr>
-        <w:t>To execute the plan and generate the Python code, follow up with:</w:t>
+        <w:t xml:space="preserve">To execute the plan and generate the Python code, follow up </w:t>
+      </w:r>
+      <w:r>
+        <w:rPr>
+          <w:rFonts w:ascii="IBM Plex Sans" w:eastAsia="IBM Plex Sans" w:hAnsi="IBM Plex Sans"/>
+        </w:rPr>
+        <w:t xml:space="preserve">in the ‘Agent’ Mode </w:t>
+      </w:r>
+      <w:r>
+        <w:rPr>
+          <w:rFonts w:ascii="IBM Plex Sans" w:eastAsia="IBM Plex Sans" w:hAnsi="IBM Plex Sans"/>
+        </w:rPr>
+        <w:t>with:</w:t>
       </w:r>
     </w:p>
     <w:p>
@@ -532,6 +580,7 @@
           <w:b/>
           <w:sz w:val="26"/>
         </w:rPr>
+        <w:lastRenderedPageBreak/>
         <w:t>4.2 — Modernise the Code Style</w:t>
       </w:r>
     </w:p>
@@ -568,7 +617,6 @@
           <w:color w:val="FFFFFF"/>
           <w:sz w:val="20"/>
         </w:rPr>
-        <w:lastRenderedPageBreak/>
         <w:t>Refactor this COBOL program to use modern best practices — improve variable naming, remove any redundant paragraphs, and add inline comments explaining each major section.</w:t>
       </w:r>
     </w:p>

</xml_diff>